<commit_message>
norma: propaga exigências de AVCB da instalação e licença CETESB (não VRA)
A partir da redação já presente no §8.2, propaga consistentemente:
- AVCB: exige-se o da instalação (vistoria de conclusão); o de projeto não substitui.
- Ambiental: licença ordinária da CETESB; a via Via Rápida Ambiental (VRA) não é aceita.
Aplicado em §7.3, §7.4, Anexo E (checklist) e Anexo M (módulo 6). Formatação e
imagens preservadas. Validado.

Co-Authored-By: Claude Opus 4.8 <noreply@anthropic.com>
Claude-Session: https://claude.ai/code/session_01Rp2scNn3jAT7JpPEQA3B4n
</commit_message>
<xml_diff>
--- a/rascunhos/NTC-D-XX-BESS/NTC-D-14_BESS_CERPRO_V9-FINAL.docx
+++ b/rascunhos/NTC-D-XX-BESS/NTC-D-14_BESS_CERPRO_V9-FINAL.docx
@@ -6254,6 +6254,9 @@
       <w:r>
         <w:t xml:space="preserve"> (Lei 12.305/2010; CONAMA 401/2008; IN Ibama 8/2012). Licenciamento ambiental conforme órgão estadual competente (CONAMA 237/1997).</w:t>
       </w:r>
+      <w:r>
+        <w:t xml:space="preserve"> Exige-se licença ambiental ordinária da CETESB; a licença expedida via Via Rápida Ambiental (VRA) não é aceita.</w:t>
+      </w:r>
     </w:p>
     <w:p>
       <w:pPr>
@@ -6326,6 +6329,9 @@
       </w:r>
       <w:r>
         <w:t xml:space="preserve"> da NFPA 855 é referência mínima ao tempo, ampliável conforme ensaio de propagação térmica. Redução só com comprovação por ensaio/barreira corta-fogo/parede incombustível. Exaustão não pode descarregar sobre rotas de fuga, passagens ou tomadas de ar.</w:t>
+      </w:r>
+      <w:r>
+        <w:t xml:space="preserve"> O documento de bombeiros exigido é o AVCB da instalação (emitido após vistoria de conclusão); o AVCB de projeto não substitui.</w:t>
       </w:r>
     </w:p>
     <w:p>
@@ -16045,7 +16051,7 @@
           <w:rFonts w:cs="Calibri"/>
           <w:color w:val="000000"/>
         </w:rPr>
-        <w:t xml:space="preserve">  AVCB</w:t>
+        <w:t xml:space="preserve">  AVCB da instalação (emitido após vistoria de conclusão) — obrigatório; o AVCB de projeto não substitui</w:t>
       </w:r>
       <w:proofErr w:type="gramEnd"/>
       <w:r>
@@ -16053,7 +16059,6 @@
           <w:rFonts w:cs="Calibri"/>
           <w:color w:val="000000"/>
         </w:rPr>
-        <w:t xml:space="preserve"> (Auto de Vistoria do Corpo de Bombeiros) ou equivalente — obrigatório</w:t>
       </w:r>
     </w:p>
     <w:p>
@@ -16077,7 +16082,7 @@
           <w:rFonts w:cs="Calibri"/>
           <w:color w:val="000000"/>
         </w:rPr>
-        <w:t xml:space="preserve">  Licenças</w:t>
+        <w:t xml:space="preserve">  Licença ambiental ordinária da CETESB (a licença via Via Rápida Ambiental – VRA não é aceita)</w:t>
       </w:r>
       <w:proofErr w:type="gramEnd"/>
       <w:r>
@@ -16085,7 +16090,6 @@
           <w:rFonts w:cs="Calibri"/>
           <w:color w:val="000000"/>
         </w:rPr>
-        <w:t xml:space="preserve"> ambientais exigíveis</w:t>
       </w:r>
     </w:p>
     <w:p>
@@ -21395,7 +21399,7 @@
         <w:rPr>
           <w:rFonts w:cs="Calibri"/>
         </w:rPr>
-        <w:t xml:space="preserve">  AVCB</w:t>
+        <w:t xml:space="preserve">  AVCB da instalação (não o de projeto)</w:t>
       </w:r>
       <w:proofErr w:type="gramEnd"/>
     </w:p>
@@ -21417,14 +21421,13 @@
         <w:rPr>
           <w:rFonts w:cs="Calibri"/>
         </w:rPr>
-        <w:t xml:space="preserve">  Licenciamento</w:t>
+        <w:t xml:space="preserve">  Licença ambiental ordinária da CETESB (VRA não aceita)</w:t>
       </w:r>
       <w:proofErr w:type="gramEnd"/>
       <w:r>
         <w:rPr>
           <w:rFonts w:cs="Calibri"/>
         </w:rPr>
-        <w:t xml:space="preserve"> ambiental</w:t>
       </w:r>
     </w:p>
     <w:p>

</xml_diff>

<commit_message>
norma: Anexo K — AVCB da instalação e licença CETESB como critérios de indeferimento
Acrescenta aos critérios de indeferimento técnico:
- Ausência de AVCB da instalação (o de projeto não substitui).
- Ausência de licença ambiental ordinária da CETESB (VRA não aceita).
Formatação e imagens preservadas. Validado.

Co-Authored-By: Claude Opus 4.8 <noreply@anthropic.com>
Claude-Session: https://claude.ai/code/session_01Rp2scNn3jAT7JpPEQA3B4n
</commit_message>
<xml_diff>
--- a/rascunhos/NTC-D-XX-BESS/NTC-D-14_BESS_CERPRO_V9-FINAL.docx
+++ b/rascunhos/NTC-D-XX-BESS/NTC-D-14_BESS_CERPRO_V9-FINAL.docx
@@ -19277,7 +19277,23 @@
         <w:ind w:left="1069"/>
       </w:pPr>
       <w:r>
-        <w:t>Inexistência de condições mínimas de segurança.</w:t>
+        <w:t>Inexistência de condições mínimas de segurança;</w:t>
+      </w:r>
+    </w:p>
+    <w:p>
+      <w:pPr>
+        <w:pStyle w:val="Commarcadores"/>
+      </w:pPr>
+      <w:r>
+        <w:t>Ausência de AVCB da instalação (o AVCB de projeto não substitui);</w:t>
+      </w:r>
+    </w:p>
+    <w:p>
+      <w:pPr>
+        <w:pStyle w:val="Commarcadores"/>
+      </w:pPr>
+      <w:r>
+        <w:t>Ausência de licença ambiental ordinária da CETESB (a licença expedida via Via Rápida Ambiental – VRA não é aceita).</w:t>
       </w:r>
     </w:p>
     <w:p>

</xml_diff>